<commit_message>
MAT282 midterm: use instructor's t, s_p, s formulas; interpret coefficients only (no coefficient significance); add cut ladder
Co-Authored-By: Claude Sonnet 5.5 <noreply@anthropic.com>
Claude-Session: https://claude.ai/code/session_01GnALAqXrg6eVpGEYyKo1Pf
</commit_message>
<xml_diff>
--- a/mat282_midterm/MAT282_Midterm_Version_A.docx
+++ b/mat282_midterm/MAT282_Midterm_Version_A.docx
@@ -2956,7 +2956,7 @@
           <w:sz w:val="19"/>
           <w:szCs w:val="19"/>
         </w:rPr>
-        <w:t xml:space="preserve">X₂ = sunshine (hours)</w:t>
+        <w:t xml:space="preserve">X₂ = weekend (1 = Saturday or Sunday, 0 = weekday)</w:t>
       </w:r>
       <w:r>
         <w:rPr>
@@ -4318,7 +4318,7 @@
                 <w:sz w:val="18"/>
                 <w:szCs w:val="18"/>
               </w:rPr>
-              <w:t xml:space="preserve">27.09</w:t>
+              <w:t xml:space="preserve">25.74</w:t>
             </w:r>
           </w:p>
         </w:tc>
@@ -4352,7 +4352,7 @@
                 <w:sz w:val="18"/>
                 <w:szCs w:val="18"/>
               </w:rPr>
-              <w:t xml:space="preserve">1.99</w:t>
+              <w:t xml:space="preserve">34.16</w:t>
             </w:r>
           </w:p>
         </w:tc>
@@ -4386,7 +4386,7 @@
                 <w:sz w:val="18"/>
                 <w:szCs w:val="18"/>
               </w:rPr>
-              <w:t xml:space="preserve">4.31</w:t>
+              <w:t xml:space="preserve">5.57</w:t>
             </w:r>
           </w:p>
         </w:tc>
@@ -4420,7 +4420,7 @@
                 <w:sz w:val="18"/>
                 <w:szCs w:val="18"/>
               </w:rPr>
-              <w:t xml:space="preserve">72.87</w:t>
+              <w:t xml:space="preserve">48.97</w:t>
             </w:r>
           </w:p>
         </w:tc>
@@ -4459,7 +4459,7 @@
                 <w:sz w:val="18"/>
                 <w:szCs w:val="18"/>
               </w:rPr>
-              <w:t xml:space="preserve">5.18</w:t>
+              <w:t xml:space="preserve">4.27</w:t>
             </w:r>
           </w:p>
         </w:tc>
@@ -4493,7 +4493,7 @@
                 <w:sz w:val="18"/>
                 <w:szCs w:val="18"/>
               </w:rPr>
-              <w:t xml:space="preserve">1.37</w:t>
+              <w:t xml:space="preserve">3.85</w:t>
             </w:r>
           </w:p>
         </w:tc>
@@ -4527,7 +4527,7 @@
                 <w:sz w:val="18"/>
                 <w:szCs w:val="18"/>
               </w:rPr>
-              <w:t xml:space="preserve">1.01</w:t>
+              <w:t xml:space="preserve">0.52</w:t>
             </w:r>
           </w:p>
         </w:tc>
@@ -4561,7 +4561,7 @@
                 <w:sz w:val="18"/>
                 <w:szCs w:val="18"/>
               </w:rPr>
-              <w:t xml:space="preserve">16.36</w:t>
+              <w:t xml:space="preserve">11.86</w:t>
             </w:r>
           </w:p>
         </w:tc>
@@ -4600,7 +4600,7 @@
                 <w:sz w:val="18"/>
                 <w:szCs w:val="18"/>
               </w:rPr>
-              <w:t xml:space="preserve">0.43</w:t>
+              <w:t xml:space="preserve">0.61</w:t>
             </w:r>
           </w:p>
         </w:tc>
@@ -4634,7 +4634,7 @@
                 <w:sz w:val="18"/>
                 <w:szCs w:val="18"/>
               </w:rPr>
-              <w:t xml:space="preserve">27.22</w:t>
+              <w:t xml:space="preserve">22.52</w:t>
             </w:r>
           </w:p>
         </w:tc>
@@ -4723,7 +4723,7 @@
                 <w:sz w:val="18"/>
                 <w:szCs w:val="18"/>
               </w:rPr>
-              <w:t xml:space="preserve">41.82</w:t>
+              <w:t xml:space="preserve">86.39</w:t>
             </w:r>
           </w:p>
         </w:tc>
@@ -4846,7 +4846,7 @@
                 <w:sz w:val="18"/>
                 <w:szCs w:val="18"/>
               </w:rPr>
-              <w:t xml:space="preserve">92995.94</w:t>
+              <w:t xml:space="preserve">131402.67</w:t>
             </w:r>
           </w:p>
         </w:tc>
@@ -4880,7 +4880,7 @@
                 <w:sz w:val="18"/>
                 <w:szCs w:val="18"/>
               </w:rPr>
-              <w:t xml:space="preserve">121553.47</w:t>
+              <w:t xml:space="preserve">83146.74</w:t>
             </w:r>
           </w:p>
         </w:tc>
@@ -5291,7 +5291,7 @@
                 <w:sz w:val="18"/>
                 <w:szCs w:val="18"/>
               </w:rPr>
-              <w:t xml:space="preserve">“The intercept means the café sells 72.87 cups on an average day.”</w:t>
+              <w:t xml:space="preserve">“The intercept means the café sells 48.97 cups on an average day.”</w:t>
             </w:r>
           </w:p>
         </w:tc>
@@ -5364,7 +5364,7 @@
                 <w:sz w:val="18"/>
                 <w:szCs w:val="18"/>
               </w:rPr>
-              <w:t xml:space="preserve">“Beach events cause the café to sell 27.09 more cups.”</w:t>
+              <w:t xml:space="preserve">“Beach events cause the café to sell 25.74 more cups.”</w:t>
             </w:r>
           </w:p>
         </w:tc>
@@ -5437,7 +5437,7 @@
                 <w:sz w:val="18"/>
                 <w:szCs w:val="18"/>
               </w:rPr>
-              <w:t xml:space="preserve">“R² = 0.43 means the model’s predictions are correct 43% of the time.”</w:t>
+              <w:t xml:space="preserve">“R² = 0.61 means the model’s predictions are correct 61% of the time.”</w:t>
             </w:r>
           </w:p>
         </w:tc>
@@ -5574,7 +5574,7 @@
                 <w:sz w:val="19"/>
                 <w:szCs w:val="19"/>
               </w:rPr>
-              <w:t xml:space="preserve">A coefficient is clearly different from zero if it is </w:t>
+              <w:t xml:space="preserve">(a) By how much does predicted sales change on a day that is </w:t>
             </w:r>
             <w:r>
               <w:rPr>
@@ -5584,7 +5584,7 @@
                 <w:sz w:val="19"/>
                 <w:szCs w:val="19"/>
               </w:rPr>
-              <w:t xml:space="preserve">more than 2 standard errors</w:t>
+              <w:t xml:space="preserve">5 °C warmer</w:t>
             </w:r>
             <w:r>
               <w:rPr>
@@ -5592,25 +5592,7 @@
                 <w:sz w:val="19"/>
                 <w:szCs w:val="19"/>
               </w:rPr>
-              <w:t xml:space="preserve"> away from zero. (a) Which one predictor is </w:t>
-            </w:r>
-            <w:r>
-              <w:rPr>
-                <w:rFonts w:ascii="Arial" w:cs="Arial" w:eastAsia="Arial" w:hAnsi="Arial"/>
-                <w:b/>
-                <w:bCs/>
-                <w:sz w:val="19"/>
-                <w:szCs w:val="19"/>
-              </w:rPr>
-              <w:t xml:space="preserve">not</w:t>
-            </w:r>
-            <w:r>
-              <w:rPr>
-                <w:rFonts w:ascii="Arial" w:cs="Arial" w:eastAsia="Arial" w:hAnsi="Arial"/>
-                <w:sz w:val="19"/>
-                <w:szCs w:val="19"/>
-              </w:rPr>
-              <w:t xml:space="preserve">? Show the comparison. (b) Use Section 1 to suggest why. (c) What would you do with this predictor?</w:t>
+              <w:t xml:space="preserve">, with the weekend and event values unchanged? (b) Which changes predicted sales more: a 5 °C rise or a beach event? (c) Why can’t you compare the temperature coefficient with the event coefficient directly?</w:t>
             </w:r>
           </w:p>
         </w:tc>
@@ -5777,7 +5759,7 @@
                 <w:sz w:val="19"/>
                 <w:szCs w:val="19"/>
               </w:rPr>
-              <w:t xml:space="preserve">Tomorrow is forecast to be 26 °C with 8 hours of sunshine and a beach event. (a) Predict gelato sales. (b) Use SE − Y to give a rough range: prediction ± 2 × SE − Y. (c) Actual sales turn out to be </w:t>
+              <w:t xml:space="preserve">Tomorrow is forecast to be 26 °C, on a weekend, with a beach event. (a) Predict gelato sales. (b) Actual sales turn out to be </w:t>
             </w:r>
             <w:r>
               <w:rPr>
@@ -5787,7 +5769,7 @@
                 <w:sz w:val="19"/>
                 <w:szCs w:val="19"/>
               </w:rPr>
-              <w:t xml:space="preserve">150 cups</w:t>
+              <w:t xml:space="preserve">215 cups</w:t>
             </w:r>
             <w:r>
               <w:rPr>
@@ -5795,7 +5777,7 @@
                 <w:sz w:val="19"/>
                 <w:szCs w:val="19"/>
               </w:rPr>
-              <w:t xml:space="preserve">. Is that surprising? Explain.</w:t>
+              <w:t xml:space="preserve">: calculate the residual. (c) SE − Y is the typical size of a forecast error. Is your residual smaller or larger than SE − Y, and what does that say about this forecast?</w:t>
             </w:r>
           </w:p>
         </w:tc>
@@ -9118,82 +9100,89 @@
         <w:t xml:space="preserve"> (Group 2). Both samples are weekdays with similar weather (about 24 °C).</w:t>
       </w:r>
     </w:p>
-    <w:tbl>
-      <w:tblPr>
-        <w:tblW w:type="dxa" w:w="10206"/>
-        <w:tblBorders>
-          <w:top w:val="single" w:color="auto" w:sz="4"/>
-          <w:left w:val="single" w:color="auto" w:sz="4"/>
-          <w:bottom w:val="single" w:color="auto" w:sz="4"/>
-          <w:right w:val="single" w:color="auto" w:sz="4"/>
-          <w:insideH w:val="single" w:color="auto" w:sz="4"/>
-          <w:insideV w:val="single" w:color="auto" w:sz="4"/>
-        </w:tblBorders>
-      </w:tblPr>
-      <w:tblGrid>
-        <w:gridCol w:w="10206"/>
-      </w:tblGrid>
-      <w:tr>
-        <w:tc>
-          <w:tcPr>
-            <w:tcW w:type="dxa" w:w="10206"/>
-            <w:tcBorders>
-              <w:top w:val="single" w:color="808080" w:sz="4"/>
-              <w:left w:val="single" w:color="808080" w:sz="4"/>
-              <w:bottom w:val="single" w:color="808080" w:sz="4"/>
-              <w:right w:val="single" w:color="808080" w:sz="4"/>
-            </w:tcBorders>
-            <w:shd w:fill="F2F2F2" w:color="auto" w:val="clear"/>
-            <w:tcMar>
-              <w:top w:type="dxa" w:w="80"/>
-              <w:left w:type="dxa" w:w="120"/>
-              <w:bottom w:type="dxa" w:w="80"/>
-              <w:right w:type="dxa" w:w="120"/>
-            </w:tcMar>
-          </w:tcPr>
-          <w:p>
-            <w:pPr>
-              <w:spacing w:after="30"/>
-            </w:pPr>
-            <w:r>
-              <w:rPr>
-                <w:rFonts w:ascii="Arial" w:cs="Arial" w:eastAsia="Arial" w:hAnsi="Arial"/>
-                <w:b/>
-                <w:bCs/>
-                <w:sz w:val="18"/>
-                <w:szCs w:val="18"/>
-              </w:rPr>
-              <w:t xml:space="preserve">Formulas.</w:t>
-            </w:r>
-            <w:r>
-              <w:rPr>
-                <w:rFonts w:ascii="Arial" w:cs="Arial" w:eastAsia="Arial" w:hAnsi="Arial"/>
-                <w:sz w:val="18"/>
-                <w:szCs w:val="18"/>
-              </w:rPr>
-              <w:t xml:space="preserve"> s = √[ Σ(x − x̄)² ÷ (n − 1) ]  ·  s_p = √[ ((n₁ − 1)s₁² + (n₂ − 1)s₂²) ÷ (n₁ + n₂ − 2) ]  ·  t = (x̄₁ − x̄₂) ÷ [ s_p × √(1/n₁ + 1/n₂) ]  ·  df = n₁ + n₂ − 2</w:t>
-            </w:r>
-          </w:p>
-          <w:p>
-            <w:pPr>
-              <w:spacing w:after="30"/>
-            </w:pPr>
-            <w:r>
-              <w:rPr>
-                <w:rFonts w:ascii="Arial" w:cs="Arial" w:eastAsia="Arial" w:hAnsi="Arial"/>
-                <w:sz w:val="18"/>
-                <w:szCs w:val="18"/>
-              </w:rPr>
-              <w:t xml:space="preserve">For df = 8 the two-tailed 5% critical value is 2.31. A negative t only means that Group 2 has the larger mean.</w:t>
-            </w:r>
-          </w:p>
-        </w:tc>
-      </w:tr>
-    </w:tbl>
     <w:p>
       <w:pPr>
-        <w:spacing w:after="80" w:before="0"/>
+        <w:keepLines/>
+        <w:spacing w:after="60" w:before="40"/>
       </w:pPr>
+      <w:r>
+        <w:rPr>
+          <w:rFonts w:ascii="Arial" w:cs="Arial" w:eastAsia="Arial" w:hAnsi="Arial"/>
+          <w:b/>
+          <w:bCs/>
+          <w:sz w:val="19"/>
+          <w:szCs w:val="19"/>
+        </w:rPr>
+        <w:t xml:space="preserve">Formulas</w:t>
+      </w:r>
+      <w:r>
+        <w:rPr>
+          <w:rFonts w:ascii="Arial" w:cs="Arial" w:eastAsia="Arial" w:hAnsi="Arial"/>
+          <w:sz w:val="19"/>
+          <w:szCs w:val="19"/>
+        </w:rPr>
+        <w:t xml:space="preserve"> (as given in class):</w:t>
+      </w:r>
+    </w:p>
+    <w:p>
+      <w:pPr>
+        <w:spacing w:after="60" w:before="40"/>
+        <w:jc w:val="center"/>
+      </w:pPr>
+      <w:r>
+        <w:drawing>
+          <wp:inline distT="0" distB="0" distL="0" distR="0">
+            <wp:extent cx="6096000" cy="676275"/>
+            <wp:effectExtent t="0" r="0" b="0" l="0"/>
+            <wp:docPr id="1" name="fig" descr="figure" title="figure"/>
+            <wp:cNvGraphicFramePr>
+              <a:graphicFrameLocks xmlns:a="http://schemas.openxmlformats.org/drawingml/2006/main" noChangeAspect="1"/>
+            </wp:cNvGraphicFramePr>
+            <a:graphic xmlns:a="http://schemas.openxmlformats.org/drawingml/2006/main">
+              <a:graphicData uri="http://schemas.openxmlformats.org/drawingml/2006/picture">
+                <pic:pic xmlns:pic="http://schemas.openxmlformats.org/drawingml/2006/picture">
+                  <pic:nvPicPr>
+                    <pic:cNvPr id="0" name="" descr=""/>
+                    <pic:cNvPicPr>
+                      <a:picLocks noChangeAspect="1" noChangeArrowheads="1"/>
+                    </pic:cNvPicPr>
+                  </pic:nvPicPr>
+                  <pic:blipFill>
+                    <a:blip r:embed="rId10" cstate="none"/>
+                    <a:srcRect/>
+                    <a:stretch>
+                      <a:fillRect/>
+                    </a:stretch>
+                  </pic:blipFill>
+                  <pic:spPr bwMode="auto">
+                    <a:xfrm>
+                      <a:off x="0" y="0"/>
+                      <a:ext cx="6096000" cy="676275"/>
+                    </a:xfrm>
+                    <a:prstGeom prst="rect">
+                      <a:avLst/>
+                    </a:prstGeom>
+                  </pic:spPr>
+                </pic:pic>
+              </a:graphicData>
+            </a:graphic>
+          </wp:inline>
+        </w:drawing>
+      </w:r>
+    </w:p>
+    <w:p>
+      <w:pPr>
+        <w:keepLines/>
+        <w:spacing w:after="60" w:before="40"/>
+      </w:pPr>
+      <w:r>
+        <w:rPr>
+          <w:rFonts w:ascii="Arial" w:cs="Arial" w:eastAsia="Arial" w:hAnsi="Arial"/>
+          <w:sz w:val="19"/>
+          <w:szCs w:val="19"/>
+        </w:rPr>
+        <w:t xml:space="preserve">A negative t only means that Group 2 has the larger mean.</w:t>
+      </w:r>
     </w:p>
     <w:p>
       <w:pPr>
@@ -11463,7 +11452,7 @@
                 <w:sz w:val="19"/>
                 <w:szCs w:val="19"/>
               </w:rPr>
-              <w:t xml:space="preserve">(i) State the null hypothesis in words. (ii) Is the difference statistically significant at 5%? Explain using the p-value and your t. (iii) In plain words, what does p = 0.031 mean?</w:t>
+              <w:t xml:space="preserve">(i) State the null hypothesis in words. (ii) Is the difference statistically significant at 5%? Explain using the p-value. (iii) In plain words, what does p = 0.031 mean?</w:t>
             </w:r>
           </w:p>
         </w:tc>

</xml_diff>